<commit_message>
fix Views, ViewModels and Controllers
</commit_message>
<xml_diff>
--- a/Documentation/Project Documentation.docx
+++ b/Documentation/Project Documentation.docx
@@ -2779,6 +2779,7 @@
           <w:szCs w:val="28"/>
           <w:lang w:val="en-US"/>
         </w:rPr>
+        <w:lastRenderedPageBreak/>
         <w:t xml:space="preserve">— Not every </w:t>
       </w:r>
       <w:r>
@@ -4075,6 +4076,7 @@
           <w:szCs w:val="28"/>
           <w:lang w:val="en-US"/>
         </w:rPr>
+        <w:lastRenderedPageBreak/>
         <w:t xml:space="preserve">— Every </w:t>
       </w:r>
       <w:r>
@@ -5979,6 +5981,7 @@
                 <w:szCs w:val="28"/>
                 <w:lang w:val="en-US"/>
               </w:rPr>
+              <w:lastRenderedPageBreak/>
               <w:t>5</w:t>
             </w:r>
           </w:p>
@@ -7921,6 +7924,7 @@
           <w:szCs w:val="28"/>
           <w:lang w:val="en-US"/>
         </w:rPr>
+        <w:lastRenderedPageBreak/>
         <w:t>— Town</w:t>
       </w:r>
       <w:r>
@@ -9501,6 +9505,7 @@
           <w:szCs w:val="28"/>
           <w:lang w:val="en-US"/>
         </w:rPr>
+        <w:lastRenderedPageBreak/>
         <w:t xml:space="preserve">— </w:t>
       </w:r>
       <w:r>
@@ -10708,6 +10713,7 @@
           <w:szCs w:val="28"/>
           <w:lang w:val="en-US"/>
         </w:rPr>
+        <w:lastRenderedPageBreak/>
         <w:t>TownN</w:t>
       </w:r>
       <w:r>
@@ -11799,6 +11805,7 @@
           <w:szCs w:val="28"/>
           <w:lang w:val="en-US"/>
         </w:rPr>
+        <w:lastRenderedPageBreak/>
         <w:t xml:space="preserve">— </w:t>
       </w:r>
       <w:r>
@@ -13408,6 +13415,7 @@
                 <w:szCs w:val="24"/>
                 <w:lang w:val="en-US"/>
               </w:rPr>
+              <w:lastRenderedPageBreak/>
               <w:t>Item</w:t>
             </w:r>
           </w:p>
@@ -21965,7 +21973,6 @@
           <w:rFonts w:ascii="Times New Roman" w:hAnsi="Times New Roman" w:cs="Times New Roman"/>
           <w:sz w:val="28"/>
           <w:szCs w:val="28"/>
-          <w:lang w:val="en-US"/>
         </w:rPr>
       </w:pPr>
       <w:r>
@@ -22204,6 +22211,7 @@
           <w:szCs w:val="28"/>
           <w:lang w:val="en-US"/>
         </w:rPr>
+        <w:lastRenderedPageBreak/>
         <w:t>text,</w:t>
       </w:r>
     </w:p>
@@ -23399,6 +23407,7 @@
           <w:szCs w:val="28"/>
           <w:lang w:val="en-US"/>
         </w:rPr>
+        <w:lastRenderedPageBreak/>
         <w:t>text (number),</w:t>
       </w:r>
     </w:p>
@@ -24762,6 +24771,7 @@
           <w:szCs w:val="28"/>
           <w:lang w:val="en-US"/>
         </w:rPr>
+        <w:lastRenderedPageBreak/>
         <w:t>button “Delete” → View Delete (Admin)</w:t>
       </w:r>
       <w:r>
@@ -25897,6 +25907,7 @@
           <w:szCs w:val="28"/>
           <w:lang w:val="en-US"/>
         </w:rPr>
+        <w:lastRenderedPageBreak/>
         <w:tab/>
         <w:t xml:space="preserve">button “Delete” </w:t>
       </w:r>
@@ -27454,6 +27465,7 @@
           <w:szCs w:val="28"/>
           <w:lang w:val="en-US"/>
         </w:rPr>
+        <w:lastRenderedPageBreak/>
         <w:t>text “Description:”,</w:t>
       </w:r>
     </w:p>
@@ -32170,6 +32182,7 @@
           <w:szCs w:val="28"/>
           <w:lang w:val="en-US"/>
         </w:rPr>
+        <w:lastRenderedPageBreak/>
         <w:t>}</w:t>
       </w:r>
       <w:r>
@@ -33944,6 +33957,7 @@
           <w:szCs w:val="28"/>
           <w:lang w:val="en-US"/>
         </w:rPr>
+        <w:lastRenderedPageBreak/>
         <w:t>Delete</w:t>
       </w:r>
     </w:p>
@@ -35287,6 +35301,7 @@
           <w:szCs w:val="28"/>
           <w:lang w:val="en-US"/>
         </w:rPr>
+        <w:lastRenderedPageBreak/>
         <w:t>},</w:t>
       </w:r>
     </w:p>
@@ -36882,6 +36897,7 @@
           <w:szCs w:val="28"/>
           <w:lang w:val="en-US"/>
         </w:rPr>
+        <w:lastRenderedPageBreak/>
         <w:t>Enemy Create, Enemy Edit</w:t>
       </w:r>
       <w:r>
@@ -38211,6 +38227,7 @@
           <w:szCs w:val="28"/>
           <w:lang w:val="en-US"/>
         </w:rPr>
+        <w:lastRenderedPageBreak/>
         <w:t xml:space="preserve">button “Back” </w:t>
       </w:r>
       <w:r>
@@ -39403,6 +39420,7 @@
           <w:szCs w:val="28"/>
           <w:lang w:val="en-US"/>
         </w:rPr>
+        <w:lastRenderedPageBreak/>
         <w:t xml:space="preserve">button “Save” </w:t>
       </w:r>
       <w:r>
@@ -40602,6 +40620,7 @@
           <w:szCs w:val="28"/>
           <w:lang w:val="en-US"/>
         </w:rPr>
+        <w:lastRenderedPageBreak/>
         <w:t xml:space="preserve">For each </w:t>
       </w:r>
       <w:r>
@@ -41218,6 +41237,7 @@
           <w:szCs w:val="28"/>
           <w:lang w:val="en-US"/>
         </w:rPr>
+        <w:lastRenderedPageBreak/>
         <w:t>Delete Recipe</w:t>
       </w:r>
     </w:p>
@@ -42899,6 +42919,7 @@
           <w:szCs w:val="28"/>
           <w:lang w:val="en-US"/>
         </w:rPr>
+        <w:lastRenderedPageBreak/>
         <w:t xml:space="preserve">Recipe </w:t>
       </w:r>
       <w:r>
@@ -45355,6 +45376,7 @@
           <w:szCs w:val="28"/>
           <w:lang w:val="en-US"/>
         </w:rPr>
+        <w:lastRenderedPageBreak/>
         <w:t xml:space="preserve">Enemy </w:t>
       </w:r>
       <w:r>
@@ -47802,6 +47824,7 @@
           <w:szCs w:val="28"/>
           <w:lang w:val="en-US"/>
         </w:rPr>
+        <w:lastRenderedPageBreak/>
         <w:t>(</w:t>
       </w:r>
       <w:r>
@@ -51204,6 +51227,7 @@
           <w:szCs w:val="20"/>
           <w:lang w:val="en-US"/>
         </w:rPr>
+        <w:lastRenderedPageBreak/>
         <w:t>public class HostileEntity</w:t>
       </w:r>
     </w:p>
@@ -52825,6 +52849,7 @@
           <w:szCs w:val="20"/>
           <w:lang w:val="en-US"/>
         </w:rPr>
+        <w:lastRenderedPageBreak/>
         <w:t xml:space="preserve">    public string GameObjectName </w:t>
       </w:r>
       <w:proofErr w:type="gramStart"/>
@@ -54617,6 +54642,7 @@
           <w:szCs w:val="20"/>
           <w:lang w:val="en-US"/>
         </w:rPr>
+        <w:lastRenderedPageBreak/>
         <w:t xml:space="preserve">    public ICollection&lt;Item&gt; Items </w:t>
       </w:r>
       <w:proofErr w:type="gramStart"/>
@@ -56327,6 +56353,7 @@
           <w:szCs w:val="20"/>
           <w:lang w:val="en-US"/>
         </w:rPr>
+        <w:lastRenderedPageBreak/>
         <w:t>}</w:t>
       </w:r>
     </w:p>
@@ -57885,6 +57912,7 @@
           <w:szCs w:val="20"/>
           <w:lang w:val="en-US"/>
         </w:rPr>
+        <w:lastRenderedPageBreak/>
         <w:t>public class TradeType</w:t>
       </w:r>
     </w:p>

</xml_diff>

<commit_message>
complete Details Views and corresponding methods
</commit_message>
<xml_diff>
--- a/Documentation/Project Documentation.docx
+++ b/Documentation/Project Documentation.docx
@@ -19486,6 +19486,7 @@
                 <w:rFonts w:ascii="Times New Roman" w:hAnsi="Times New Roman" w:cs="Times New Roman"/>
                 <w:sz w:val="28"/>
                 <w:szCs w:val="28"/>
+                <w:highlight w:val="green"/>
                 <w:lang w:val="en-US"/>
               </w:rPr>
               <w:t>User</w:t>
@@ -19495,6 +19496,7 @@
                 <w:rFonts w:ascii="Times New Roman" w:hAnsi="Times New Roman" w:cs="Times New Roman"/>
                 <w:sz w:val="28"/>
                 <w:szCs w:val="28"/>
+                <w:highlight w:val="green"/>
                 <w:lang w:val="en-US"/>
               </w:rPr>
               <w:t>, Admin</w:t>
@@ -19802,6 +19804,7 @@
                 <w:rFonts w:ascii="Times New Roman" w:hAnsi="Times New Roman" w:cs="Times New Roman"/>
                 <w:sz w:val="28"/>
                 <w:szCs w:val="28"/>
+                <w:highlight w:val="green"/>
                 <w:lang w:val="en-US"/>
               </w:rPr>
               <w:t>User</w:t>
@@ -19811,6 +19814,7 @@
                 <w:rFonts w:ascii="Times New Roman" w:hAnsi="Times New Roman" w:cs="Times New Roman"/>
                 <w:sz w:val="28"/>
                 <w:szCs w:val="28"/>
+                <w:highlight w:val="green"/>
                 <w:lang w:val="en-US"/>
               </w:rPr>
               <w:t>, Admin</w:t>
@@ -20272,6 +20276,7 @@
                 <w:rFonts w:ascii="Times New Roman" w:hAnsi="Times New Roman" w:cs="Times New Roman"/>
                 <w:sz w:val="28"/>
                 <w:szCs w:val="28"/>
+                <w:highlight w:val="green"/>
                 <w:lang w:val="en-US"/>
               </w:rPr>
               <w:t>User</w:t>
@@ -20281,6 +20286,7 @@
                 <w:rFonts w:ascii="Times New Roman" w:hAnsi="Times New Roman" w:cs="Times New Roman"/>
                 <w:sz w:val="28"/>
                 <w:szCs w:val="28"/>
+                <w:highlight w:val="green"/>
                 <w:lang w:val="en-US"/>
               </w:rPr>
               <w:t>, Admin</w:t>
@@ -20423,7 +20429,6 @@
                 <w:rFonts w:ascii="Times New Roman" w:hAnsi="Times New Roman" w:cs="Times New Roman"/>
                 <w:sz w:val="28"/>
                 <w:szCs w:val="28"/>
-                <w:lang w:val="en-US"/>
               </w:rPr>
             </w:pPr>
             <w:r>
@@ -20590,6 +20595,7 @@
                 <w:rFonts w:ascii="Times New Roman" w:hAnsi="Times New Roman" w:cs="Times New Roman"/>
                 <w:sz w:val="28"/>
                 <w:szCs w:val="28"/>
+                <w:highlight w:val="green"/>
                 <w:lang w:val="en-US"/>
               </w:rPr>
               <w:t>User</w:t>
@@ -20599,6 +20605,7 @@
                 <w:rFonts w:ascii="Times New Roman" w:hAnsi="Times New Roman" w:cs="Times New Roman"/>
                 <w:sz w:val="28"/>
                 <w:szCs w:val="28"/>
+                <w:highlight w:val="green"/>
                 <w:lang w:val="en-US"/>
               </w:rPr>
               <w:t>, Admin</w:t>
@@ -20742,6 +20749,7 @@
                 <w:rFonts w:ascii="Times New Roman" w:hAnsi="Times New Roman" w:cs="Times New Roman"/>
                 <w:sz w:val="28"/>
                 <w:szCs w:val="28"/>
+                <w:highlight w:val="green"/>
                 <w:lang w:val="en-US"/>
               </w:rPr>
             </w:pPr>
@@ -20750,6 +20758,7 @@
                 <w:rFonts w:ascii="Times New Roman" w:hAnsi="Times New Roman" w:cs="Times New Roman"/>
                 <w:sz w:val="28"/>
                 <w:szCs w:val="28"/>
+                <w:highlight w:val="green"/>
                 <w:lang w:val="en-US"/>
               </w:rPr>
               <w:t>User, Admin</w:t>

</xml_diff>

<commit_message>
complete data validation in Views
</commit_message>
<xml_diff>
--- a/Documentation/Project Documentation.docx
+++ b/Documentation/Project Documentation.docx
@@ -19486,7 +19486,6 @@
                 <w:rFonts w:ascii="Times New Roman" w:hAnsi="Times New Roman" w:cs="Times New Roman"/>
                 <w:sz w:val="28"/>
                 <w:szCs w:val="28"/>
-                <w:highlight w:val="green"/>
                 <w:lang w:val="en-US"/>
               </w:rPr>
               <w:t>User</w:t>
@@ -19496,7 +19495,6 @@
                 <w:rFonts w:ascii="Times New Roman" w:hAnsi="Times New Roman" w:cs="Times New Roman"/>
                 <w:sz w:val="28"/>
                 <w:szCs w:val="28"/>
-                <w:highlight w:val="green"/>
                 <w:lang w:val="en-US"/>
               </w:rPr>
               <w:t>, Admin</w:t>
@@ -19804,7 +19802,6 @@
                 <w:rFonts w:ascii="Times New Roman" w:hAnsi="Times New Roman" w:cs="Times New Roman"/>
                 <w:sz w:val="28"/>
                 <w:szCs w:val="28"/>
-                <w:highlight w:val="green"/>
                 <w:lang w:val="en-US"/>
               </w:rPr>
               <w:t>User</w:t>
@@ -19814,7 +19811,6 @@
                 <w:rFonts w:ascii="Times New Roman" w:hAnsi="Times New Roman" w:cs="Times New Roman"/>
                 <w:sz w:val="28"/>
                 <w:szCs w:val="28"/>
-                <w:highlight w:val="green"/>
                 <w:lang w:val="en-US"/>
               </w:rPr>
               <w:t>, Admin</w:t>
@@ -20276,7 +20272,6 @@
                 <w:rFonts w:ascii="Times New Roman" w:hAnsi="Times New Roman" w:cs="Times New Roman"/>
                 <w:sz w:val="28"/>
                 <w:szCs w:val="28"/>
-                <w:highlight w:val="green"/>
                 <w:lang w:val="en-US"/>
               </w:rPr>
               <w:t>User</w:t>
@@ -20286,7 +20281,6 @@
                 <w:rFonts w:ascii="Times New Roman" w:hAnsi="Times New Roman" w:cs="Times New Roman"/>
                 <w:sz w:val="28"/>
                 <w:szCs w:val="28"/>
-                <w:highlight w:val="green"/>
                 <w:lang w:val="en-US"/>
               </w:rPr>
               <w:t>, Admin</w:t>
@@ -20595,7 +20589,6 @@
                 <w:rFonts w:ascii="Times New Roman" w:hAnsi="Times New Roman" w:cs="Times New Roman"/>
                 <w:sz w:val="28"/>
                 <w:szCs w:val="28"/>
-                <w:highlight w:val="green"/>
                 <w:lang w:val="en-US"/>
               </w:rPr>
               <w:t>User</w:t>
@@ -20605,7 +20598,6 @@
                 <w:rFonts w:ascii="Times New Roman" w:hAnsi="Times New Roman" w:cs="Times New Roman"/>
                 <w:sz w:val="28"/>
                 <w:szCs w:val="28"/>
-                <w:highlight w:val="green"/>
                 <w:lang w:val="en-US"/>
               </w:rPr>
               <w:t>, Admin</w:t>
@@ -20749,7 +20741,6 @@
                 <w:rFonts w:ascii="Times New Roman" w:hAnsi="Times New Roman" w:cs="Times New Roman"/>
                 <w:sz w:val="28"/>
                 <w:szCs w:val="28"/>
-                <w:highlight w:val="green"/>
                 <w:lang w:val="en-US"/>
               </w:rPr>
             </w:pPr>
@@ -20758,7 +20749,6 @@
                 <w:rFonts w:ascii="Times New Roman" w:hAnsi="Times New Roman" w:cs="Times New Roman"/>
                 <w:sz w:val="28"/>
                 <w:szCs w:val="28"/>
-                <w:highlight w:val="green"/>
                 <w:lang w:val="en-US"/>
               </w:rPr>
               <w:t>User, Admin</w:t>

</xml_diff>